<commit_message>
ExposureIQ: grounding-only answers, section-aware retrieval, eval harness
- Synthesis prompt forbids outside knowledge and unstated causes;
  interpretation must be marked "(inference)"
- Classifier now picks target filing sections (MDA/RISK/NOTES/BUSINESS/
  GOVERNANCE); vector search spends half its budget inside them, mapped
  across 10-K/10-Q/20-F section ids, with a top-up to k chunks
- graphrag/eval: 26-question set, Opus-judged claim-level faithfulness and
  1-5 relevance; results for all three configurations with manual audit
  (current: 96.9% faithfulness, 100% relevance)
- README and architecture doc gain an Evaluation section; cost range updated

Co-Authored-By: Claude Opus 5.5 <noreply@anthropic.com>
</commit_message>
<xml_diff>
--- a/docs/ExposureIQ_Architecture.docx
+++ b/docs/ExposureIQ_Architecture.docx
@@ -2105,7 +2105,7 @@
               <w:rPr>
                 <w:sz w:val="19"/>
               </w:rPr>
-              <w:t>Chooses GRAPH, VECTOR or HYBRID retrieval and rates the question SIMPLE or MULTIHOP</w:t>
+              <w:t>Chooses GRAPH, VECTOR or HYBRID retrieval, rates the question SIMPLE or MULTIHOP, and names the filing sections likely to hold the answer (MD&amp;A, risk factors, notes, business, governance)</w:t>
             </w:r>
           </w:p>
         </w:tc>
@@ -2229,7 +2229,7 @@
               <w:rPr>
                 <w:sz w:val="19"/>
               </w:rPr>
-              <w:t>Embeds the question, searches Chroma filtered to the companies it names, and for multi-hop questions adds each company's latest backlog (RPO) figures via exact-text match</w:t>
+              <w:t>Embeds the question and searches Chroma filtered to the companies it names. Half the budget is restricted to the chosen sections, mapped across forms (MD&amp;A = item_7 in a 10-K, part1_item2 in a 10-Q, item_5 in a 20-F). Multi-hop questions also get each company's latest backlog (RPO) figures via exact-text match</w:t>
             </w:r>
           </w:p>
         </w:tc>
@@ -2837,7 +2837,7 @@
               <w:rPr>
                 <w:sz w:val="19"/>
               </w:rPr>
-              <w:t>~$0.06–$0.13, 25–40 seconds</w:t>
+              <w:t>~$0.06–$0.18, 25–40 seconds</w:t>
             </w:r>
           </w:p>
         </w:tc>
@@ -2849,7 +2849,416 @@
         <w:pStyle w:val="Heading1"/>
       </w:pPr>
       <w:r>
-        <w:t>10. Limitations and roadmap</w:t>
+        <w:t>10. Evaluation</w:t>
+      </w:r>
+    </w:p>
+    <w:p>
+      <w:r>
+        <w:rPr>
+          <w:i w:val="0"/>
+        </w:rPr>
+        <w:t>A 26-question set (8 graph, 11 text, 6 multi-hop, 1 out-of-scope) is graded by Claude Opus 4.7. Faithfulness splits each answer into factual claims and checks each against the retrieved evidence; relevance rates 1–5 whether the answer addresses the question.</w:t>
+      </w:r>
+    </w:p>
+    <w:tbl>
+      <w:tblPr>
+        <w:tblStyle w:val="TableGrid"/>
+        <w:tblW w:type="auto" w:w="0"/>
+        <w:jc w:val="center"/>
+        <w:tblLook w:firstColumn="1" w:firstRow="1" w:lastColumn="0" w:lastRow="0" w:noHBand="0" w:noVBand="1" w:val="04A0"/>
+      </w:tblPr>
+      <w:tblGrid>
+        <w:gridCol w:w="1930"/>
+        <w:gridCol w:w="1930"/>
+        <w:gridCol w:w="1930"/>
+        <w:gridCol w:w="1930"/>
+        <w:gridCol w:w="1930"/>
+      </w:tblGrid>
+      <w:tr>
+        <w:tc>
+          <w:tcPr>
+            <w:tcW w:type="dxa" w:w="3312"/>
+            <w:shd w:val="clear" w:color="auto" w:fill="0F1B2D"/>
+          </w:tcPr>
+          <w:p>
+            <w:r/>
+            <w:r>
+              <w:rPr>
+                <w:b/>
+                <w:color w:val="FFFFFF"/>
+                <w:sz w:val="19"/>
+              </w:rPr>
+              <w:t>Configuration</w:t>
+            </w:r>
+          </w:p>
+        </w:tc>
+        <w:tc>
+          <w:tcPr>
+            <w:tcW w:type="dxa" w:w="1584"/>
+            <w:shd w:val="clear" w:color="auto" w:fill="0F1B2D"/>
+          </w:tcPr>
+          <w:p>
+            <w:r/>
+            <w:r>
+              <w:rPr>
+                <w:b/>
+                <w:color w:val="FFFFFF"/>
+                <w:sz w:val="19"/>
+              </w:rPr>
+              <w:t>Faithfulness (strict)</w:t>
+            </w:r>
+          </w:p>
+        </w:tc>
+        <w:tc>
+          <w:tcPr>
+            <w:tcW w:type="dxa" w:w="1584"/>
+            <w:shd w:val="clear" w:color="auto" w:fill="0F1B2D"/>
+          </w:tcPr>
+          <w:p>
+            <w:r/>
+            <w:r>
+              <w:rPr>
+                <w:b/>
+                <w:color w:val="FFFFFF"/>
+                <w:sz w:val="19"/>
+              </w:rPr>
+              <w:t>Faithfulness (lenient)</w:t>
+            </w:r>
+          </w:p>
+        </w:tc>
+        <w:tc>
+          <w:tcPr>
+            <w:tcW w:type="dxa" w:w="1584"/>
+            <w:shd w:val="clear" w:color="auto" w:fill="0F1B2D"/>
+          </w:tcPr>
+          <w:p>
+            <w:r/>
+            <w:r>
+              <w:rPr>
+                <w:b/>
+                <w:color w:val="FFFFFF"/>
+                <w:sz w:val="19"/>
+              </w:rPr>
+              <w:t>Relevance (≥4/5)</w:t>
+            </w:r>
+          </w:p>
+        </w:tc>
+        <w:tc>
+          <w:tcPr>
+            <w:tcW w:type="dxa" w:w="1584"/>
+            <w:shd w:val="clear" w:color="auto" w:fill="0F1B2D"/>
+          </w:tcPr>
+          <w:p>
+            <w:r/>
+            <w:r>
+              <w:rPr>
+                <w:b/>
+                <w:color w:val="FFFFFF"/>
+                <w:sz w:val="19"/>
+              </w:rPr>
+              <w:t>Mean relevance</w:t>
+            </w:r>
+          </w:p>
+        </w:tc>
+      </w:tr>
+      <w:tr>
+        <w:tc>
+          <w:tcPr>
+            <w:tcW w:type="dxa" w:w="3312"/>
+          </w:tcPr>
+          <w:p>
+            <w:r>
+              <w:rPr>
+                <w:sz w:val="19"/>
+              </w:rPr>
+            </w:r>
+            <w:r>
+              <w:rPr>
+                <w:sz w:val="19"/>
+              </w:rPr>
+              <w:t>Original</w:t>
+            </w:r>
+          </w:p>
+        </w:tc>
+        <w:tc>
+          <w:tcPr>
+            <w:tcW w:type="dxa" w:w="1584"/>
+          </w:tcPr>
+          <w:p>
+            <w:r>
+              <w:rPr>
+                <w:sz w:val="19"/>
+              </w:rPr>
+            </w:r>
+            <w:r>
+              <w:rPr>
+                <w:sz w:val="19"/>
+              </w:rPr>
+              <w:t>93.2%</w:t>
+            </w:r>
+          </w:p>
+        </w:tc>
+        <w:tc>
+          <w:tcPr>
+            <w:tcW w:type="dxa" w:w="1584"/>
+          </w:tcPr>
+          <w:p>
+            <w:r>
+              <w:rPr>
+                <w:sz w:val="19"/>
+              </w:rPr>
+            </w:r>
+            <w:r>
+              <w:rPr>
+                <w:sz w:val="19"/>
+              </w:rPr>
+              <w:t>95.7%</w:t>
+            </w:r>
+          </w:p>
+        </w:tc>
+        <w:tc>
+          <w:tcPr>
+            <w:tcW w:type="dxa" w:w="1584"/>
+          </w:tcPr>
+          <w:p>
+            <w:r>
+              <w:rPr>
+                <w:sz w:val="19"/>
+              </w:rPr>
+            </w:r>
+            <w:r>
+              <w:rPr>
+                <w:sz w:val="19"/>
+              </w:rPr>
+              <w:t>100%</w:t>
+            </w:r>
+          </w:p>
+        </w:tc>
+        <w:tc>
+          <w:tcPr>
+            <w:tcW w:type="dxa" w:w="1584"/>
+          </w:tcPr>
+          <w:p>
+            <w:r>
+              <w:rPr>
+                <w:sz w:val="19"/>
+              </w:rPr>
+            </w:r>
+            <w:r>
+              <w:rPr>
+                <w:sz w:val="19"/>
+              </w:rPr>
+              <w:t>4.73</w:t>
+            </w:r>
+          </w:p>
+        </w:tc>
+      </w:tr>
+      <w:tr>
+        <w:tc>
+          <w:tcPr>
+            <w:tcW w:type="dxa" w:w="3312"/>
+          </w:tcPr>
+          <w:p>
+            <w:r>
+              <w:rPr>
+                <w:sz w:val="19"/>
+              </w:rPr>
+            </w:r>
+            <w:r>
+              <w:rPr>
+                <w:sz w:val="19"/>
+              </w:rPr>
+              <w:t>+ Grounding-only answer prompt</w:t>
+            </w:r>
+          </w:p>
+        </w:tc>
+        <w:tc>
+          <w:tcPr>
+            <w:tcW w:type="dxa" w:w="1584"/>
+          </w:tcPr>
+          <w:p>
+            <w:r>
+              <w:rPr>
+                <w:sz w:val="19"/>
+              </w:rPr>
+            </w:r>
+            <w:r>
+              <w:rPr>
+                <w:sz w:val="19"/>
+              </w:rPr>
+              <w:t>97.1%</w:t>
+            </w:r>
+          </w:p>
+        </w:tc>
+        <w:tc>
+          <w:tcPr>
+            <w:tcW w:type="dxa" w:w="1584"/>
+          </w:tcPr>
+          <w:p>
+            <w:r>
+              <w:rPr>
+                <w:sz w:val="19"/>
+              </w:rPr>
+            </w:r>
+            <w:r>
+              <w:rPr>
+                <w:sz w:val="19"/>
+              </w:rPr>
+              <w:t>98.1%</w:t>
+            </w:r>
+          </w:p>
+        </w:tc>
+        <w:tc>
+          <w:tcPr>
+            <w:tcW w:type="dxa" w:w="1584"/>
+          </w:tcPr>
+          <w:p>
+            <w:r>
+              <w:rPr>
+                <w:sz w:val="19"/>
+              </w:rPr>
+            </w:r>
+            <w:r>
+              <w:rPr>
+                <w:sz w:val="19"/>
+              </w:rPr>
+              <w:t>92%</w:t>
+            </w:r>
+          </w:p>
+        </w:tc>
+        <w:tc>
+          <w:tcPr>
+            <w:tcW w:type="dxa" w:w="1584"/>
+          </w:tcPr>
+          <w:p>
+            <w:r>
+              <w:rPr>
+                <w:sz w:val="19"/>
+              </w:rPr>
+            </w:r>
+            <w:r>
+              <w:rPr>
+                <w:sz w:val="19"/>
+              </w:rPr>
+              <w:t>4.65</w:t>
+            </w:r>
+          </w:p>
+        </w:tc>
+      </w:tr>
+      <w:tr>
+        <w:tc>
+          <w:tcPr>
+            <w:tcW w:type="dxa" w:w="3312"/>
+          </w:tcPr>
+          <w:p>
+            <w:r>
+              <w:rPr>
+                <w:sz w:val="19"/>
+              </w:rPr>
+            </w:r>
+            <w:r>
+              <w:rPr>
+                <w:b/>
+                <w:sz w:val="19"/>
+              </w:rPr>
+              <w:t>+ Section-aware retrieval (current)</w:t>
+            </w:r>
+            <w:r>
+              <w:rPr>
+                <w:sz w:val="19"/>
+              </w:rPr>
+            </w:r>
+          </w:p>
+        </w:tc>
+        <w:tc>
+          <w:tcPr>
+            <w:tcW w:type="dxa" w:w="1584"/>
+          </w:tcPr>
+          <w:p>
+            <w:r>
+              <w:rPr>
+                <w:sz w:val="19"/>
+              </w:rPr>
+            </w:r>
+            <w:r>
+              <w:rPr>
+                <w:sz w:val="19"/>
+              </w:rPr>
+              <w:t>96.9%</w:t>
+            </w:r>
+          </w:p>
+        </w:tc>
+        <w:tc>
+          <w:tcPr>
+            <w:tcW w:type="dxa" w:w="1584"/>
+          </w:tcPr>
+          <w:p>
+            <w:r>
+              <w:rPr>
+                <w:sz w:val="19"/>
+              </w:rPr>
+            </w:r>
+            <w:r>
+              <w:rPr>
+                <w:sz w:val="19"/>
+              </w:rPr>
+              <w:t>98.0%</w:t>
+            </w:r>
+          </w:p>
+        </w:tc>
+        <w:tc>
+          <w:tcPr>
+            <w:tcW w:type="dxa" w:w="1584"/>
+          </w:tcPr>
+          <w:p>
+            <w:r>
+              <w:rPr>
+                <w:sz w:val="19"/>
+              </w:rPr>
+            </w:r>
+            <w:r>
+              <w:rPr>
+                <w:sz w:val="19"/>
+              </w:rPr>
+              <w:t>100%</w:t>
+            </w:r>
+          </w:p>
+        </w:tc>
+        <w:tc>
+          <w:tcPr>
+            <w:tcW w:type="dxa" w:w="1584"/>
+          </w:tcPr>
+          <w:p>
+            <w:r>
+              <w:rPr>
+                <w:sz w:val="19"/>
+              </w:rPr>
+            </w:r>
+            <w:r>
+              <w:rPr>
+                <w:sz w:val="19"/>
+              </w:rPr>
+              <w:t>4.81</w:t>
+            </w:r>
+          </w:p>
+        </w:tc>
+      </w:tr>
+    </w:tbl>
+    <w:p/>
+    <w:p>
+      <w:r>
+        <w:rPr>
+          <w:i w:val="0"/>
+        </w:rPr>
+        <w:t>Forbidding outside knowledge lifted faithfulness but exposed retrieval gaps; section-aware retrieval closed them (e.g. Meta's capex outlook now comes from MD&amp;A, not proxy tables). The grader was audited by hand and leans slightly strict. One run per configuration on 26 questions, with a same-family judge: indicative, not a benchmark.</w:t>
+      </w:r>
+    </w:p>
+    <w:p>
+      <w:pPr>
+        <w:pStyle w:val="Heading1"/>
+      </w:pPr>
+      <w:r>
+        <w:t>11. Limitations and roadmap</w:t>
       </w:r>
     </w:p>
     <w:p>
@@ -2919,7 +3328,7 @@
         <w:t>Evaluation.</w:t>
       </w:r>
       <w:r>
-        <w:t xml:space="preserve"> A question set with graded answers and citations is planned.</w:t>
+        <w:t xml:space="preserve"> Grow the 26-question set, add a judge from a different model family, and run each configuration several times.</w:t>
       </w:r>
     </w:p>
     <w:sectPr>

</xml_diff>